<commit_message>
Update Word document with audit fixes
Co-Authored-By: Claude Opus 4.6 <noreply@anthropic.com>
Claude-Session: https://claude.ai/code/session_01URL6QPmi3DbR7y1hxGToYe
</commit_message>
<xml_diff>
--- a/Hairstyles-for-Men-with-Straight-Hair-Complete-Guide.docx
+++ b/Hairstyles-for-Men-with-Straight-Hair-Complete-Guide.docx
@@ -891,6 +891,108 @@
           </w:p>
         </w:tc>
       </w:tr>
+      <w:tr>
+        <w:tc>
+          <w:tcPr>
+            <w:tcW w:type="dxa" w:w="1400"/>
+            <w:shd w:fill="f8f9fa" w:val="clear"/>
+            <w:tcMar>
+              <w:top w:type="dxa" w:w="40"/>
+              <w:left w:type="dxa" w:w="80"/>
+              <w:bottom w:type="dxa" w:w="40"/>
+              <w:right w:type="dxa" w:w="80"/>
+            </w:tcMar>
+          </w:tcPr>
+          <w:p>
+            <w:pPr>
+              <w:spacing w:after="40" w:before="40"/>
+            </w:pPr>
+            <w:r>
+              <w:rPr>
+                <w:rFonts w:ascii="Calibri" w:cs="Calibri" w:eastAsia="Calibri" w:hAnsi="Calibri"/>
+                <w:sz w:val="20"/>
+                <w:szCs w:val="20"/>
+              </w:rPr>
+              <w:t xml:space="preserve">Triangle</w:t>
+            </w:r>
+          </w:p>
+        </w:tc>
+        <w:tc>
+          <w:tcPr>
+            <w:tcW w:type="dxa" w:w="3000"/>
+            <w:shd w:fill="f8f9fa" w:val="clear"/>
+            <w:tcMar>
+              <w:top w:type="dxa" w:w="40"/>
+              <w:left w:type="dxa" w:w="80"/>
+              <w:bottom w:type="dxa" w:w="40"/>
+              <w:right w:type="dxa" w:w="80"/>
+            </w:tcMar>
+          </w:tcPr>
+          <w:p>
+            <w:pPr>
+              <w:spacing w:after="40" w:before="40"/>
+            </w:pPr>
+            <w:r>
+              <w:rPr>
+                <w:rFonts w:ascii="Calibri" w:cs="Calibri" w:eastAsia="Calibri" w:hAnsi="Calibri"/>
+                <w:sz w:val="20"/>
+                <w:szCs w:val="20"/>
+              </w:rPr>
+              <w:t xml:space="preserve">Textured quiff, pompadour, side-swept fringe with volume on top</w:t>
+            </w:r>
+          </w:p>
+        </w:tc>
+        <w:tc>
+          <w:tcPr>
+            <w:tcW w:type="dxa" w:w="2400"/>
+            <w:shd w:fill="f8f9fa" w:val="clear"/>
+            <w:tcMar>
+              <w:top w:type="dxa" w:w="40"/>
+              <w:left w:type="dxa" w:w="80"/>
+              <w:bottom w:type="dxa" w:w="40"/>
+              <w:right w:type="dxa" w:w="80"/>
+            </w:tcMar>
+          </w:tcPr>
+          <w:p>
+            <w:pPr>
+              <w:spacing w:after="40" w:before="40"/>
+            </w:pPr>
+            <w:r>
+              <w:rPr>
+                <w:rFonts w:ascii="Calibri" w:cs="Calibri" w:eastAsia="Calibri" w:hAnsi="Calibri"/>
+                <w:sz w:val="20"/>
+                <w:szCs w:val="20"/>
+              </w:rPr>
+              <w:t xml:space="preserve">Cuts that add bulk at the jawline — full beards paired with short tops</w:t>
+            </w:r>
+          </w:p>
+        </w:tc>
+        <w:tc>
+          <w:tcPr>
+            <w:tcW w:type="dxa" w:w="2560"/>
+            <w:shd w:fill="f8f9fa" w:val="clear"/>
+            <w:tcMar>
+              <w:top w:type="dxa" w:w="40"/>
+              <w:left w:type="dxa" w:w="80"/>
+              <w:bottom w:type="dxa" w:w="40"/>
+              <w:right w:type="dxa" w:w="80"/>
+            </w:tcMar>
+          </w:tcPr>
+          <w:p>
+            <w:pPr>
+              <w:spacing w:after="40" w:before="40"/>
+            </w:pPr>
+            <w:r>
+              <w:rPr>
+                <w:rFonts w:ascii="Calibri" w:cs="Calibri" w:eastAsia="Calibri" w:hAnsi="Calibri"/>
+                <w:sz w:val="20"/>
+                <w:szCs w:val="20"/>
+              </w:rPr>
+              <w:t xml:space="preserve">The wider jaw needs visual weight shifted upward toward the forehead</w:t>
+            </w:r>
+          </w:p>
+        </w:tc>
+      </w:tr>
     </w:tbl>
     <w:p>
       <w:pPr>
@@ -925,7 +1027,7 @@
           <w:sz w:val="22"/>
           <w:szCs w:val="22"/>
         </w:rPr>
-        <w:t xml:space="preserve">Stand in front of a mirror with your hair pulled back. Compare three measurements — forehead width, cheekbone width, and jawline width. If all three are roughly equal, you have a square or round face (jaw angle tells you which). If your forehead is widest, that is heart-shaped. If your cheekbones are widest, diamond. If your face is noticeably longer than wide, oblong. If nothing stands out, oval.</w:t>
+        <w:t xml:space="preserve">Stand in front of a mirror with your hair pulled back. Compare three measurements — forehead width, cheekbone width, and jawline width. If all three are roughly equal, you have a square or round face (jaw angle tells you which). If your forehead is widest, that is heart-shaped. If your cheekbones are widest, diamond. If your jawline is the widest point, triangle. If your face is noticeably longer than wide, oblong. If nothing stands out, oval. Men with a large forehead should also factor forehead coverage into their cut choice — fringe styles and textured crops work well.</w:t>
       </w:r>
     </w:p>
     <w:p>
@@ -2503,7 +2605,7 @@
           <w:sz w:val="22"/>
           <w:szCs w:val="22"/>
         </w:rPr>
-        <w:t xml:space="preserve">Hair swept firmly to one side (3–4 inches on top) with a mid to high fade on the sides. The comb over lost its old-school stigma years ago — modern versions are textured, voluminous, and sharp. Straight hair makes the directional sweep look clean and deliberate.</w:t>
+        <w:t xml:space="preserve">Hair swept firmly to one side (3–4 inches on top) with a mid to high fade on the sides. The comb over lost its old-school stigma years ago — and its classic version remains the most requested cut in professional barbershops — modern versions are textured, voluminous, and sharp. Straight hair makes the directional sweep look clean and deliberate.</w:t>
       </w:r>
     </w:p>
     <w:p>
@@ -4477,7 +4579,7 @@
           <w:sz w:val="22"/>
           <w:szCs w:val="22"/>
         </w:rPr>
-        <w:t xml:space="preserve">The trend direction in 2026 moves away from rigid, high-shine styling toward natural texture, matte finishes, and cuts that work with hair rather than against it. Heavy gel and stiff holds are declining. Movement and flexibility are taking over, according to styling trend reports from Booksy and Fresha's 2025 barbershop data.</w:t>
+        <w:t xml:space="preserve">The trend direction in 2026 moves away from rigid, high-shine styling toward natural texture, matte finishes, and cuts that work with hair rather than against it. Heavy gel and stiff holds are declining. Movement and flexibility are taking over, according to styling trend reports from Booksy's 2026 Beauty Industry Trends Report and Fresha's Selfcare Report 2025.</w:t>
       </w:r>
     </w:p>
     <w:p>

</xml_diff>

<commit_message>
Regenerate Word doc with all final fixes
Co-Authored-By: Claude Opus 4.6 <noreply@anthropic.com>
Claude-Session: https://claude.ai/code/session_01URL6QPmi3DbR7y1hxGToYe
</commit_message>
<xml_diff>
--- a/Hairstyles-for-Men-with-Straight-Hair-Complete-Guide.docx
+++ b/Hairstyles-for-Men-with-Straight-Hair-Complete-Guide.docx
@@ -52,10 +52,33 @@
       <w:r>
         <w:rPr>
           <w:rFonts w:ascii="Calibri" w:cs="Calibri" w:eastAsia="Calibri" w:hAnsi="Calibri"/>
-          <w:sz w:val="22"/>
-          <w:szCs w:val="22"/>
-        </w:rPr>
-        <w:t xml:space="preserve">This guide covers 35 haircuts that actually work on straight hair, organized by length. Each one includes face shape matches, what to tell your barber, and a styling tip you can use immediately. No filler. No recycled advice. Just cuts that hold shape on hair that falls straight.</w:t>
+          <w:b/>
+          <w:bCs/>
+          <w:sz w:val="22"/>
+          <w:szCs w:val="22"/>
+        </w:rPr>
+        <w:t xml:space="preserve">Quick answer: </w:t>
+      </w:r>
+      <w:r>
+        <w:rPr>
+          <w:rFonts w:ascii="Calibri" w:cs="Calibri" w:eastAsia="Calibri" w:hAnsi="Calibri"/>
+          <w:sz w:val="22"/>
+          <w:szCs w:val="22"/>
+        </w:rPr>
+        <w:t xml:space="preserve">The crew cut, textured quiff, and side part consistently rank as the strongest all-round choices for straight hair because they hold shape with minimal product, suit most face shapes, and take under five minutes to style each morning.</w:t>
+      </w:r>
+    </w:p>
+    <w:p>
+      <w:pPr>
+        <w:spacing w:after="120" w:before="0"/>
+      </w:pPr>
+      <w:r>
+        <w:rPr>
+          <w:rFonts w:ascii="Calibri" w:cs="Calibri" w:eastAsia="Calibri" w:hAnsi="Calibri"/>
+          <w:sz w:val="22"/>
+          <w:szCs w:val="22"/>
+        </w:rPr>
+        <w:t xml:space="preserve">This guide covers 35 haircuts that work on straight hair, organized by length. Each one includes face shape matches, what to tell your barber, and a styling tip you can use the same day.</w:t>
       </w:r>
     </w:p>
     <w:p>
@@ -141,7 +164,7 @@
           <w:sz w:val="22"/>
           <w:szCs w:val="22"/>
         </w:rPr>
-        <w:t xml:space="preserve">Most guides mention face shapes in passing. This table gives you a direct answer.</w:t>
+        <w:t xml:space="preserve">Your face shape determines which cuts sharpen your features and which ones work against them.</w:t>
       </w:r>
     </w:p>
     <w:tbl>
@@ -3031,7 +3054,7 @@
           <w:sz w:val="22"/>
           <w:szCs w:val="22"/>
         </w:rPr>
-        <w:t xml:space="preserve">Apply sea salt spray to the entire head while damp, rough-dry the top, and let the back air-dry naturally for a relaxed flow.</w:t>
+        <w:t xml:space="preserve">Apply a salt-based texturizing spray to the entire head while damp, rough-dry the top, and let the back air-dry naturally for a relaxed flow.</w:t>
       </w:r>
     </w:p>
     <w:p>
@@ -5035,7 +5058,7 @@
           <w:sz w:val="22"/>
           <w:szCs w:val="22"/>
         </w:rPr>
-        <w:t xml:space="preserve">Sea salt spray on damp hair, rough-dry with fingers, and leave it alone. Avoid brushing — combing layered straight hair defeats the purpose.</w:t>
+        <w:t xml:space="preserve">A lightweight salt spray on damp hair, rough-dry with fingers, and leave it alone. Avoid brushing — combing layered straight hair defeats the purpose.</w:t>
       </w:r>
     </w:p>
     <w:p>
@@ -5182,7 +5205,7 @@
           <w:sz w:val="22"/>
           <w:szCs w:val="22"/>
         </w:rPr>
-        <w:t xml:space="preserve">Most guides say "apply product and style." That is not a routine. Here is one with actual timing:</w:t>
+        <w:t xml:space="preserve">Most styling advice stops at "apply product and style." That skips the how. Here is a real routine with actual timing:</w:t>
       </w:r>
     </w:p>
     <w:p>
@@ -7323,6 +7346,19 @@
       <w:r>
         <w:rPr>
           <w:rFonts w:ascii="Calibri" w:cs="Calibri" w:eastAsia="Calibri" w:hAnsi="Calibri"/>
+          <w:sz w:val="22"/>
+          <w:szCs w:val="22"/>
+        </w:rPr>
+        <w:t xml:space="preserve">The Professional Beauty Association recommends scheduling trims based on how quickly your specific cut loses its intended shape — not on a fixed calendar.</w:t>
+      </w:r>
+    </w:p>
+    <w:p>
+      <w:pPr>
+        <w:spacing w:after="120" w:before="0"/>
+      </w:pPr>
+      <w:r>
+        <w:rPr>
+          <w:rFonts w:ascii="Calibri" w:cs="Calibri" w:eastAsia="Calibri" w:hAnsi="Calibri"/>
           <w:b/>
           <w:bCs/>
           <w:sz w:val="22"/>
@@ -7508,7 +7544,7 @@
           <w:sz w:val="26"/>
           <w:szCs w:val="26"/>
         </w:rPr>
-        <w:t xml:space="preserve">What is the best hairstyle for men with straight hair?</w:t>
+        <w:t xml:space="preserve">Can I switch between two different hairstyles without getting a new cut?</w:t>
       </w:r>
     </w:p>
     <w:p>
@@ -7521,7 +7557,7 @@
           <w:sz w:val="22"/>
           <w:szCs w:val="22"/>
         </w:rPr>
-        <w:t xml:space="preserve">No single answer fits everyone. For low maintenance, a crew cut or textured crop requires minimal daily effort. For maximum impact, a pompadour or slick back stands out. For versatility, a side part or quiff transitions between casual and professional settings without changing the cut. Match the style to your face shape, lifestyle, and how much time you are willing to spend each morning.</w:t>
+        <w:t xml:space="preserve">Yes, if the base cut supports it. A 3–4 inch top with tapered sides lets you wear a side part one day and a slick back the next — the only change is product and blow-dry direction. Shorter cuts like a buzz or crew cut are locked into one look. Medium-length cuts give you the most daily flexibility.</w:t>
       </w:r>
     </w:p>
     <w:p>
@@ -7538,7 +7574,7 @@
           <w:sz w:val="26"/>
           <w:szCs w:val="26"/>
         </w:rPr>
-        <w:t xml:space="preserve">How do I add volume to flat straight hair?</w:t>
+        <w:t xml:space="preserve">How do I grow out a short haircut without looking awkward?</w:t>
       </w:r>
     </w:p>
     <w:p>
@@ -7551,7 +7587,7 @@
           <w:sz w:val="22"/>
           <w:szCs w:val="22"/>
         </w:rPr>
-        <w:t xml:space="preserve">Three things work together: the right cut (layers that remove weight from the bottom), the right technique (blow-dry at the roots with a round brush, lifting upward), and the right product (texture powder or sea salt spray rather than heavy cream or pomade). Volumizing shampoo also helps by removing buildup that flattens roots.</w:t>
+        <w:t xml:space="preserve">The awkward stage hits around weeks 6–10, when the sides puff outward while the top is still catching up. Ask your barber for maintenance trims on the sides only — keep them tapered while the top grows. A headband, styling cream, or a backward sweep with light pomade hides the transition. Most men need 4–6 months to go from a crew cut to a combable medium length.</w:t>
       </w:r>
     </w:p>
     <w:p>
@@ -7568,7 +7604,7 @@
           <w:sz w:val="26"/>
           <w:szCs w:val="26"/>
         </w:rPr>
-        <w:t xml:space="preserve">Can men with straight hair get a textured look?</w:t>
+        <w:t xml:space="preserve">Does sleeping on straight hair damage the style for the next day?</w:t>
       </w:r>
     </w:p>
     <w:p>
@@ -7581,7 +7617,7 @@
           <w:sz w:val="22"/>
           <w:szCs w:val="22"/>
         </w:rPr>
-        <w:t xml:space="preserve">Yes. Texture on straight hair comes from the cutting technique — point-cutting, razor cutting, and internal layering create separation and movement that mimics natural texture. Products like matte clay and sea salt spray enhance the effect. You do not need wavy or curly hair to achieve a textured finish.</w:t>
+        <w:t xml:space="preserve">Straight hair flattens overnight more than any other texture because the smooth strands compress against the pillow. A silk or satin pillowcase reduces friction and static. In the morning, a 30-second blast of heat at the roots with a blow dryer restores lift without re-wetting. Avoid cotton pillowcases — the rougher surface pulls moisture from the hair and increases next-day flatness.</w:t>
       </w:r>
     </w:p>
     <w:p>
@@ -7598,7 +7634,7 @@
           <w:sz w:val="26"/>
           <w:szCs w:val="26"/>
         </w:rPr>
-        <w:t xml:space="preserve">How often should men with straight hair visit the barber?</w:t>
+        <w:t xml:space="preserve">Should I show my barber a photo or describe the cut in words?</w:t>
       </w:r>
     </w:p>
     <w:p>
@@ -7611,7 +7647,7 @@
           <w:sz w:val="22"/>
           <w:szCs w:val="22"/>
         </w:rPr>
-        <w:t xml:space="preserve">It depends on the cut. Short fades and hard parts need touch-ups every 2–3 weeks. Medium-length structured cuts like the side part or pompadour hold shape for 4–5 weeks. Longer styles only need trimming every 8–12 weeks for split-end maintenance. The Professional Beauty Association recommends scheduling trims based on how quickly your specific cut loses its intended shape.</w:t>
+        <w:t xml:space="preserve">Both. A reference photo sets the visual target, but verbal instructions prevent misinterpretation. Tell your barber the guard number you want on the sides, the length on top in inches, and whether you want a fade or a taper. Photos of celebrities often show post-production styling or naturally wavy hair — your barber can flag what will translate differently on your texture.</w:t>
       </w:r>
     </w:p>
     <w:p>
@@ -7628,7 +7664,7 @@
           <w:sz w:val="26"/>
           <w:szCs w:val="26"/>
         </w:rPr>
-        <w:t xml:space="preserve">Which fade works best with straight hair?</w:t>
+        <w:t xml:space="preserve">Why does my straight hair look good after the barber but not when I style it at home?</w:t>
       </w:r>
     </w:p>
     <w:p>
@@ -7641,7 +7677,7 @@
           <w:sz w:val="22"/>
           <w:szCs w:val="22"/>
         </w:rPr>
-        <w:t xml:space="preserve">Low fades and mid fades blend smoothly with straight hair and suit professional settings. High fades and skin fades create bolder contrast and suit casual or creative environments. Burst fades and drop fades add unique silhouettes for men who want something less conventional.</w:t>
+        <w:t xml:space="preserve">Three reasons. First, barbers blow-dry with professional-grade heat and technique — most men skip the dryer at home. Second, barbers apply product to damp hair at the right moisture level, not to fully dry or soaking wet hair. Third, the cut looks freshest on day one; after a week of sleeping, sweating, and touching it, shape softens. Learning to blow-dry with direction — even for two minutes — closes most of the gap between salon finish and home finish.</w:t>
       </w:r>
     </w:p>
     <w:p>
@@ -7658,7 +7694,7 @@
           <w:sz w:val="26"/>
           <w:szCs w:val="26"/>
         </w:rPr>
-        <w:t xml:space="preserve">Is straight hair easier to maintain than curly hair?</w:t>
+        <w:t xml:space="preserve">What is the difference between a taper and a fade?</w:t>
       </w:r>
     </w:p>
     <w:p>
@@ -7671,7 +7707,7 @@
           <w:sz w:val="22"/>
           <w:szCs w:val="22"/>
         </w:rPr>
-        <w:t xml:space="preserve">In most ways, yes. Straight hair is more predictable, easier to comb, and requires fewer specialized products. But it shows oil and greasiness faster than curly or coily hair, needs more frequent washing, and reveals imprecise cuts immediately — there is no curl pattern to hide a barber's mistake.</w:t>
+        <w:t xml:space="preserve">A taper gradually shortens hair from top to bottom but leaves visible length at the lowest point — typically a #2 or #3 guard at the neckline. A fade takes that gradient all the way down to bare skin. Tapers look more conservative and suit professional environments. Fades create sharper contrast and read as more modern. Both work well on straight hair — the choice is about how much contrast you want between the top and sides.</w:t>
       </w:r>
     </w:p>
     <w:sectPr>

</xml_diff>

<commit_message>
Move Quick Answer box to right after H1 for AEO optimization
Co-Authored-By: Claude Opus 4.6 <noreply@anthropic.com>
Claude-Session: https://claude.ai/code/session_01URL6QPmi3DbR7y1hxGToYe
</commit_message>
<xml_diff>
--- a/Hairstyles-for-Men-with-Straight-Hair-Complete-Guide.docx
+++ b/Hairstyles-for-Men-with-Straight-Hair-Complete-Guide.docx
@@ -39,6 +39,29 @@
       <w:r>
         <w:rPr>
           <w:rFonts w:ascii="Calibri" w:cs="Calibri" w:eastAsia="Calibri" w:hAnsi="Calibri"/>
+          <w:b/>
+          <w:bCs/>
+          <w:sz w:val="22"/>
+          <w:szCs w:val="22"/>
+        </w:rPr>
+        <w:t xml:space="preserve">Quick answer: </w:t>
+      </w:r>
+      <w:r>
+        <w:rPr>
+          <w:rFonts w:ascii="Calibri" w:cs="Calibri" w:eastAsia="Calibri" w:hAnsi="Calibri"/>
+          <w:sz w:val="22"/>
+          <w:szCs w:val="22"/>
+        </w:rPr>
+        <w:t xml:space="preserve">The crew cut, textured quiff, and side part consistently rank as the strongest all-round choices for straight hair because they hold shape with minimal product, suit most face shapes, and take under five minutes to style each morning.</w:t>
+      </w:r>
+    </w:p>
+    <w:p>
+      <w:pPr>
+        <w:spacing w:after="120" w:before="0"/>
+      </w:pPr>
+      <w:r>
+        <w:rPr>
+          <w:rFonts w:ascii="Calibri" w:cs="Calibri" w:eastAsia="Calibri" w:hAnsi="Calibri"/>
           <w:sz w:val="22"/>
           <w:szCs w:val="22"/>
         </w:rPr>
@@ -52,46 +75,10 @@
       <w:r>
         <w:rPr>
           <w:rFonts w:ascii="Calibri" w:cs="Calibri" w:eastAsia="Calibri" w:hAnsi="Calibri"/>
-          <w:b/>
-          <w:bCs/>
-          <w:sz w:val="22"/>
-          <w:szCs w:val="22"/>
-        </w:rPr>
-        <w:t xml:space="preserve">Quick answer: </w:t>
-      </w:r>
-      <w:r>
-        <w:rPr>
-          <w:rFonts w:ascii="Calibri" w:cs="Calibri" w:eastAsia="Calibri" w:hAnsi="Calibri"/>
-          <w:sz w:val="22"/>
-          <w:szCs w:val="22"/>
-        </w:rPr>
-        <w:t xml:space="preserve">The crew cut, textured quiff, and side part consistently rank as the strongest all-round choices for straight hair because they hold shape with minimal product, suit most face shapes, and take under five minutes to style each morning.</w:t>
-      </w:r>
-    </w:p>
-    <w:p>
-      <w:pPr>
-        <w:spacing w:after="120" w:before="0"/>
-      </w:pPr>
-      <w:r>
-        <w:rPr>
-          <w:rFonts w:ascii="Calibri" w:cs="Calibri" w:eastAsia="Calibri" w:hAnsi="Calibri"/>
-          <w:sz w:val="22"/>
-          <w:szCs w:val="22"/>
-        </w:rPr>
-        <w:t xml:space="preserve">This guide covers 35 haircuts that work on straight hair, organized by length. Each one includes face shape matches, what to tell your barber, and a styling tip you can use the same day.</w:t>
-      </w:r>
-    </w:p>
-    <w:p>
-      <w:pPr>
-        <w:spacing w:after="120" w:before="0"/>
-      </w:pPr>
-      <w:r>
-        <w:rPr>
-          <w:rFonts w:ascii="Calibri" w:cs="Calibri" w:eastAsia="Calibri" w:hAnsi="Calibri"/>
-          <w:sz w:val="22"/>
-          <w:szCs w:val="22"/>
-        </w:rPr>
-        <w:t xml:space="preserve">If your hair is thick and dense, we have a separate guide covering cuts that manage bulk: </w:t>
+          <w:sz w:val="22"/>
+          <w:szCs w:val="22"/>
+        </w:rPr>
+        <w:t xml:space="preserve">This guide covers 35 haircuts that work on straight hair, organized by length. Each one includes face shape matches, what to tell your barber, and a styling tip you can use the same day. If your hair is thick and dense, we have a separate guide covering cuts that manage bulk: </w:t>
       </w:r>
       <w:r>
         <w:rPr>

</xml_diff>

<commit_message>
Remove all em dashes from article and regenerate Word doc
Replaced 99 em dashes with contextually appropriate alternatives
(commas, colons, periods) throughout the markdown and docx files.

Co-Authored-By: Claude Opus 4.6 <noreply@anthropic.com>
Claude-Session: https://claude.ai/code/session_01URL6QPmi3DbR7y1hxGToYe
</commit_message>
<xml_diff>
--- a/Hairstyles-for-Men-with-Straight-Hair-Complete-Guide.docx
+++ b/Hairstyles-for-Men-with-Straight-Hair-Complete-Guide.docx
@@ -65,7 +65,7 @@
           <w:sz w:val="22"/>
           <w:szCs w:val="22"/>
         </w:rPr>
-        <w:t xml:space="preserve">Straight hair sits flat from root to tip. It reflects light evenly, rarely frizzes, and holds clean lines better than any other hair type. That makes it the easiest texture to cut and style — but also the easiest to get wrong. A bad cut on straight hair has nowhere to hide.</w:t>
+        <w:t xml:space="preserve">Straight hair sits flat from root to tip. It reflects light evenly, rarely frizzes, and holds clean lines better than any other hair type. That makes it the easiest texture to cut and style, but also the easiest to get wrong. A bad cut on straight hair has nowhere to hide.</w:t>
       </w:r>
     </w:p>
     <w:p>
@@ -98,7 +98,7 @@
           <w:sz w:val="22"/>
           <w:szCs w:val="22"/>
         </w:rPr>
-        <w:t xml:space="preserve">. If your hair is fine or thinning, the approach changes — read </w:t>
+        <w:t xml:space="preserve">. If your hair is fine or thinning, the approach changes. Read </w:t>
       </w:r>
       <w:r>
         <w:rPr>
@@ -336,7 +336,7 @@
                 <w:sz w:val="20"/>
                 <w:szCs w:val="20"/>
               </w:rPr>
-              <w:t xml:space="preserve">Almost anything — crew cut, quiff, pompadour, curtain bangs</w:t>
+              <w:t xml:space="preserve">Almost anything: crew cut, quiff, pompadour, curtain bangs</w:t>
             </w:r>
           </w:p>
         </w:tc>
@@ -438,7 +438,7 @@
                 <w:sz w:val="20"/>
                 <w:szCs w:val="20"/>
               </w:rPr>
-              <w:t xml:space="preserve">Height on top — pompadour, quiff, faux hawk, textured crop with high fade</w:t>
+              <w:t xml:space="preserve">Height on top: pompadour, quiff, faux hawk, textured crop with high fade</w:t>
             </w:r>
           </w:p>
         </w:tc>
@@ -973,7 +973,7 @@
                 <w:sz w:val="20"/>
                 <w:szCs w:val="20"/>
               </w:rPr>
-              <w:t xml:space="preserve">Cuts that add bulk at the jawline — full beards paired with short tops</w:t>
+              <w:t xml:space="preserve">Cuts that add bulk at the jawline, such as full beards paired with short tops</w:t>
             </w:r>
           </w:p>
         </w:tc>
@@ -1037,7 +1037,7 @@
           <w:sz w:val="22"/>
           <w:szCs w:val="22"/>
         </w:rPr>
-        <w:t xml:space="preserve">Stand in front of a mirror with your hair pulled back. Compare three measurements — forehead width, cheekbone width, and jawline width. If all three are roughly equal, you have a square or round face (jaw angle tells you which). If your forehead is widest, that is heart-shaped. If your cheekbones are widest, diamond. If your jawline is the widest point, triangle. If your face is noticeably longer than wide, oblong. If nothing stands out, oval. Men with a large forehead should also factor forehead coverage into their cut choice — fringe styles and textured crops work well.</w:t>
+        <w:t xml:space="preserve">Stand in front of a mirror with your hair pulled back. Compare three measurements: forehead width, cheekbone width, and jawline width. If all three are roughly equal, you have a square or round face (jaw angle tells you which). If your forehead is widest, that is heart-shaped. If your cheekbones are widest, diamond. If your jawline is the widest point, triangle. If your face is noticeably longer than wide, oblong. If nothing stands out, oval. Men with a large forehead should also factor forehead coverage into their cut choice. Fringe styles and textured crops work well.</w:t>
       </w:r>
     </w:p>
     <w:p>
@@ -1100,7 +1100,7 @@
           <w:sz w:val="22"/>
           <w:szCs w:val="22"/>
         </w:rPr>
-        <w:t xml:space="preserve">A single clipper guard all over — typically a #2 or #3. Zero styling required. The buzz cut strips everything back to the skull shape, so it works best on men with symmetrical head shapes and defined facial features. Jason Statham built an entire career look around this cut.</w:t>
+        <w:t xml:space="preserve">A single clipper guard all over, typically a #2 or #3. Zero styling required. The buzz cut strips everything back to the skull shape, so it works best on men with symmetrical head shapes and defined facial features. Jason Statham built an entire career look around this cut.</w:t>
       </w:r>
     </w:p>
     <w:p>
@@ -1184,7 +1184,7 @@
           <w:sz w:val="22"/>
           <w:szCs w:val="22"/>
         </w:rPr>
-        <w:t xml:space="preserve">No product needed. Apply SPF to the scalp in summer — exposed skin burns fast.</w:t>
+        <w:t xml:space="preserve">No product needed. Apply SPF to the scalp in summer. Exposed skin burns fast.</w:t>
       </w:r>
     </w:p>
     <w:p>
@@ -1242,7 +1242,7 @@
           <w:sz w:val="22"/>
           <w:szCs w:val="22"/>
         </w:rPr>
-        <w:t xml:space="preserve">Round, oval — the sharp edges add angles to softer faces</w:t>
+        <w:t xml:space="preserve">Round, oval. The sharp edges add angles to softer faces</w:t>
       </w:r>
     </w:p>
     <w:p>
@@ -1328,7 +1328,7 @@
           <w:sz w:val="22"/>
           <w:szCs w:val="22"/>
         </w:rPr>
-        <w:t xml:space="preserve">One to two inches on top, tapered sides. The crew cut is the most reliable short haircut in men's grooming — it flatters every face shape and works in every professional setting. Straight hair makes the top lie flat and controlled, which is exactly what this cut demands. Chris Evans wore a textured crew cut through most of his Captain America run.</w:t>
+        <w:t xml:space="preserve">One to two inches on top, tapered sides. The crew cut is the most reliable short haircut in men's grooming. It flatters every face shape and works in every professional setting. Straight hair makes the top lie flat and controlled, which is exactly what this cut demands. Chris Evans wore a textured crew cut through most of his Captain America run.</w:t>
       </w:r>
     </w:p>
     <w:p>
@@ -1442,7 +1442,7 @@
           <w:sz w:val="22"/>
           <w:szCs w:val="22"/>
         </w:rPr>
-        <w:t xml:space="preserve">Short on the sides with a choppy, forward-falling fringe that sits just above the eyebrows. The fringe is point-cut (scissors held at an angle) to remove weight and create internal movement — this prevents the flat-sheet look that straight hair defaults to at this length. Tom Holland wore a version of this in multiple press tours.</w:t>
+        <w:t xml:space="preserve">Short on the sides with a choppy, forward-falling fringe that sits just above the eyebrows. The fringe is point-cut (scissors held at an angle) to remove weight and create internal movement. This prevents the flat-sheet look that straight hair defaults to at this length. Tom Holland wore a version of this in multiple press tours.</w:t>
       </w:r>
     </w:p>
     <w:p>
@@ -1470,7 +1470,7 @@
           <w:sz w:val="22"/>
           <w:szCs w:val="22"/>
         </w:rPr>
-        <w:t xml:space="preserve">Round, oval, heart — the fringe shortens a long face and balances a wide forehead</w:t>
+        <w:t xml:space="preserve">Round, oval, heart. The fringe shortens a long face and balances a wide forehead</w:t>
       </w:r>
     </w:p>
     <w:p>
@@ -1556,7 +1556,7 @@
           <w:sz w:val="22"/>
           <w:szCs w:val="22"/>
         </w:rPr>
-        <w:t xml:space="preserve">A short, blunt fringe cut straight across the forehead with uniform length on top (about one to two inches). The Caesar has a deliberate, geometric quality that straight hair handles perfectly — every strand sits exactly where it should. This cut also works as a strategic choice for men with slightly receding hairlines, since the forward fringe covers the hairline naturally.</w:t>
+        <w:t xml:space="preserve">A short, blunt fringe cut straight across the forehead with uniform length on top (about one to two inches). The Caesar has a deliberate, geometric quality that straight hair handles perfectly. Every strand sits exactly where it should. This cut also works as a strategic choice for men with slightly receding hairlines, since the forward fringe covers the hairline naturally.</w:t>
       </w:r>
     </w:p>
     <w:p>
@@ -1670,7 +1670,7 @@
           <w:sz w:val="22"/>
           <w:szCs w:val="22"/>
         </w:rPr>
-        <w:t xml:space="preserve">A blunt, perfectly horizontal fringe paired with a high skin fade. The Edgar originated in Latin American barbering culture and gained global popularity through social media. The look is geometric, bold, and intentional — the hard horizontal line across the top meets nearly invisible sides. Straight hair with enough density holds that sharp line without breaking.</w:t>
+        <w:t xml:space="preserve">A blunt, perfectly horizontal fringe paired with a high skin fade. The Edgar originated in Latin American barbering culture and gained global popularity through social media. The look is geometric, bold, and intentional. The hard horizontal line across the top meets nearly invisible sides. Straight hair with enough density holds that sharp line without breaking.</w:t>
       </w:r>
     </w:p>
     <w:p>
@@ -1698,7 +1698,7 @@
           <w:sz w:val="22"/>
           <w:szCs w:val="22"/>
         </w:rPr>
-        <w:t xml:space="preserve">Square, diamond — angular faces match the geometric structure</w:t>
+        <w:t xml:space="preserve">Square, diamond. Angular faces match the geometric structure</w:t>
       </w:r>
     </w:p>
     <w:p>
@@ -1726,7 +1726,7 @@
           <w:sz w:val="22"/>
           <w:szCs w:val="22"/>
         </w:rPr>
-        <w:t xml:space="preserve">"Edgar cut — high skin fade, blunt horizontal fringe, crisp line at the top."</w:t>
+        <w:t xml:space="preserve">"Edgar cut: high skin fade, blunt horizontal fringe, crisp line at the top."</w:t>
       </w:r>
     </w:p>
     <w:p>
@@ -1840,7 +1840,7 @@
           <w:sz w:val="22"/>
           <w:szCs w:val="22"/>
         </w:rPr>
-        <w:t xml:space="preserve">"High and tight — sides to skin, keep about an inch on top, fade at the temples."</w:t>
+        <w:t xml:space="preserve">"High and tight: sides to skin, keep about an inch on top, fade at the temples."</w:t>
       </w:r>
     </w:p>
     <w:p>
@@ -1898,7 +1898,7 @@
           <w:sz w:val="22"/>
           <w:szCs w:val="22"/>
         </w:rPr>
-        <w:t xml:space="preserve">The sides fade down to bare skin while the top stays at two to four inches with point-cut texture for movement and separation. This is one of the most requested cuts globally in 2026, according to barbershop trend reports from Booksy. Straight hair benefits heavily from the textured top — without it, the contrast between the faded sides and a flat top looks unfinished.</w:t>
+        <w:t xml:space="preserve">The sides fade down to bare skin while the top stays at two to four inches with point-cut texture for movement and separation. This is one of the most requested cuts globally in 2026, according to barbershop trend reports from Booksy. Straight hair benefits heavily from the textured top. Without it, the contrast between the faded sides and a flat top looks unfinished.</w:t>
       </w:r>
     </w:p>
     <w:p>
@@ -1926,7 +1926,7 @@
           <w:sz w:val="22"/>
           <w:szCs w:val="22"/>
         </w:rPr>
-        <w:t xml:space="preserve">All face shapes — universally flattering</w:t>
+        <w:t xml:space="preserve">All face shapes. Universally flattering</w:t>
       </w:r>
     </w:p>
     <w:p>
@@ -1982,7 +1982,7 @@
           <w:sz w:val="22"/>
           <w:szCs w:val="22"/>
         </w:rPr>
-        <w:t xml:space="preserve">Rough-dry with a blow dryer while tousling with your fingers. Apply matte clay and define sections for a piece-y, separated finish. Do not comb — the imperfection is the point.</w:t>
+        <w:t xml:space="preserve">Rough-dry with a blow dryer while tousling with your fingers. Apply matte clay and define sections for a piece-y, separated finish. Do not comb. The imperfection is the point.</w:t>
       </w:r>
     </w:p>
     <w:p>
@@ -2012,7 +2012,7 @@
           <w:sz w:val="22"/>
           <w:szCs w:val="22"/>
         </w:rPr>
-        <w:t xml:space="preserve">A short textured top with a razor-shaved line cut into the scalp along the natural parting. The hard part creates a visible white line that adds geometric precision. This is a high-detail cut — the shaved line and textured top require a skilled barber who understands proportions.</w:t>
+        <w:t xml:space="preserve">A short textured top with a razor-shaved line cut into the scalp along the natural parting. The hard part creates a visible white line that adds geometric precision. This is a high-detail cut. The shaved line and textured top require a skilled barber who understands proportions.</w:t>
       </w:r>
     </w:p>
     <w:p>
@@ -2040,7 +2040,7 @@
           <w:sz w:val="22"/>
           <w:szCs w:val="22"/>
         </w:rPr>
-        <w:t xml:space="preserve">All face shapes — the hard part adds structure to any profile</w:t>
+        <w:t xml:space="preserve">All face shapes. The hard part adds structure to any profile</w:t>
       </w:r>
     </w:p>
     <w:p>
@@ -2154,7 +2154,7 @@
           <w:sz w:val="22"/>
           <w:szCs w:val="22"/>
         </w:rPr>
-        <w:t xml:space="preserve">Oval, round — the curved silhouette softens angular skull shapes</w:t>
+        <w:t xml:space="preserve">Oval, round. The curved silhouette softens angular skull shapes</w:t>
       </w:r>
     </w:p>
     <w:p>
@@ -2243,7 +2243,7 @@
           <w:sz w:val="22"/>
           <w:szCs w:val="22"/>
         </w:rPr>
-        <w:t xml:space="preserve">Medium length gives you the most styling options. You can wear these cuts slicked back, swept sideways, or textured forward — and change the look daily with different products.</w:t>
+        <w:t xml:space="preserve">Medium length gives you the most styling options. You can wear these cuts slicked back, swept sideways, or textured forward, and change the look daily with different products.</w:t>
       </w:r>
     </w:p>
     <w:p>
@@ -2301,7 +2301,7 @@
           <w:sz w:val="22"/>
           <w:szCs w:val="22"/>
         </w:rPr>
-        <w:t xml:space="preserve">Square, heart, diamond — the structured part adds symmetry</w:t>
+        <w:t xml:space="preserve">Square, heart, diamond. The structured part adds symmetry</w:t>
       </w:r>
     </w:p>
     <w:p>
@@ -2387,7 +2387,7 @@
           <w:sz w:val="22"/>
           <w:szCs w:val="22"/>
         </w:rPr>
-        <w:t xml:space="preserve">Volume swept upward and backward from the forehead, creating dramatic height at the front. The pompadour is architecturally the most ambitious men's hairstyle — and straight hair needs deliberate blow-drying to build that lift. Elvis Presley made it iconic. David Beckham and Bruno Mars brought it back.</w:t>
+        <w:t xml:space="preserve">Volume swept upward and backward from the forehead, creating dramatic height at the front. The pompadour is architecturally the most ambitious men's hairstyle, and straight hair needs deliberate blow-drying to build that lift. Elvis Presley made it iconic. David Beckham and Bruno Mars brought it back.</w:t>
       </w:r>
     </w:p>
     <w:p>
@@ -2415,7 +2415,7 @@
           <w:sz w:val="22"/>
           <w:szCs w:val="22"/>
         </w:rPr>
-        <w:t xml:space="preserve">Oval, round, square — vertical volume elongates the face</w:t>
+        <w:t xml:space="preserve">Oval, round, square. Vertical volume elongates the face</w:t>
       </w:r>
     </w:p>
     <w:p>
@@ -2443,7 +2443,7 @@
           <w:sz w:val="22"/>
           <w:szCs w:val="22"/>
         </w:rPr>
-        <w:t xml:space="preserve">"Pompadour — 4 to 5 inches on top, mid fade on the sides, blend the back."</w:t>
+        <w:t xml:space="preserve">"Pompadour: 4 to 5 inches on top, mid fade on the sides, blend the back."</w:t>
       </w:r>
     </w:p>
     <w:p>
@@ -2501,7 +2501,7 @@
           <w:sz w:val="22"/>
           <w:szCs w:val="22"/>
         </w:rPr>
-        <w:t xml:space="preserve">A shorter, more relaxed version of the pompadour. The front lifts upward and slightly to one side with visible texture and separation — intentionally disheveled rather than sculpted. Zayn Malik wore variations of this throughout his solo career. The quiff works especially well on fine straight hair because the internal texture adds visual bulk.</w:t>
+        <w:t xml:space="preserve">A shorter, more relaxed version of the pompadour. The front lifts upward and slightly to one side with visible texture and separation, intentionally disheveled rather than sculpted. Zayn Malik wore variations of this throughout his solo career. The quiff works especially well on fine straight hair because the internal texture adds visual bulk.</w:t>
       </w:r>
     </w:p>
     <w:p>
@@ -2529,7 +2529,7 @@
           <w:sz w:val="22"/>
           <w:szCs w:val="22"/>
         </w:rPr>
-        <w:t xml:space="preserve">All face shapes — one of the most versatile medium-length cuts</w:t>
+        <w:t xml:space="preserve">All face shapes. One of the most versatile medium-length cuts</w:t>
       </w:r>
     </w:p>
     <w:p>
@@ -2557,7 +2557,7 @@
           <w:sz w:val="22"/>
           <w:szCs w:val="22"/>
         </w:rPr>
-        <w:t xml:space="preserve">"Textured quiff — 3 inches at the front, tapered shorter toward the crown, low taper on the sides."</w:t>
+        <w:t xml:space="preserve">"Textured quiff: 3 inches at the front, tapered shorter toward the crown, low taper on the sides."</w:t>
       </w:r>
     </w:p>
     <w:p>
@@ -2615,7 +2615,7 @@
           <w:sz w:val="22"/>
           <w:szCs w:val="22"/>
         </w:rPr>
-        <w:t xml:space="preserve">Hair swept firmly to one side (3–4 inches on top) with a mid to high fade on the sides. The comb over lost its old-school stigma years ago — and its classic version remains the most requested cut in professional barbershops — modern versions are textured, voluminous, and sharp. Straight hair makes the directional sweep look clean and deliberate.</w:t>
+        <w:t xml:space="preserve">Hair swept firmly to one side (3–4 inches on top) with a mid to high fade on the sides. The comb over lost its old-school stigma years ago, and its classic version remains the most requested cut in professional barbershops. Modern versions are textured, voluminous, and sharp. Straight hair makes the directional sweep look clean and deliberate.</w:t>
       </w:r>
     </w:p>
     <w:p>
@@ -2729,7 +2729,7 @@
           <w:sz w:val="22"/>
           <w:szCs w:val="22"/>
         </w:rPr>
-        <w:t xml:space="preserve">All hair swept directly backward from the forehead. The 2026 version uses matte or low-shine products for an airy, natural flow — not the heavy, greasy look from decades past. Brad Pitt in Fury showed how a slick back with an undercut creates a controlled, military-sharp aesthetic.</w:t>
+        <w:t xml:space="preserve">All hair swept directly backward from the forehead. The 2026 version uses matte or low-shine products for an airy, natural flow, not the heavy, greasy look from decades past. Brad Pitt in Fury showed how a slick back with an undercut creates a controlled, military-sharp aesthetic.</w:t>
       </w:r>
     </w:p>
     <w:p>
@@ -2785,7 +2785,7 @@
           <w:sz w:val="22"/>
           <w:szCs w:val="22"/>
         </w:rPr>
-        <w:t xml:space="preserve">"Slick back — 4 to 5 inches on top, undercut or low fade on the sides, tight neckline."</w:t>
+        <w:t xml:space="preserve">"Slick back: 4 to 5 inches on top, undercut or low fade on the sides, tight neckline."</w:t>
       </w:r>
     </w:p>
     <w:p>
@@ -2899,7 +2899,7 @@
           <w:sz w:val="22"/>
           <w:szCs w:val="22"/>
         </w:rPr>
-        <w:t xml:space="preserve">"Faux hawk — mid to high fade on the sides, leave 3 inches through the center."</w:t>
+        <w:t xml:space="preserve">"Faux hawk: mid to high fade on the sides, leave 3 inches through the center."</w:t>
       </w:r>
     </w:p>
     <w:p>
@@ -2957,7 +2957,7 @@
           <w:sz w:val="22"/>
           <w:szCs w:val="22"/>
         </w:rPr>
-        <w:t xml:space="preserve">The mullet returned in the early 2020s and is now a legitimate style choice — not a joke. The 2026 version keeps the sides neatly tapered, the top textured and forward-styled, and the back grown to collar length with layers for movement. Straight hair gives the back section an elegant, flowing silhouette that heavier textures struggle to achieve.</w:t>
+        <w:t xml:space="preserve">The mullet returned in the early 2020s and is now a legitimate style choice, not a joke. The 2026 version keeps the sides neatly tapered, the top textured and forward-styled, and the back grown to collar length with layers for movement. Straight hair gives the back section an elegant, flowing silhouette that heavier textures struggle to achieve.</w:t>
       </w:r>
     </w:p>
     <w:p>
@@ -3013,7 +3013,7 @@
           <w:sz w:val="22"/>
           <w:szCs w:val="22"/>
         </w:rPr>
-        <w:t xml:space="preserve">"Modern mullet — tapered sides, textured top styled forward, back to the collar with layers."</w:t>
+        <w:t xml:space="preserve">"Modern mullet: tapered sides, textured top styled forward, back to the collar with layers."</w:t>
       </w:r>
     </w:p>
     <w:p>
@@ -3071,7 +3071,7 @@
           <w:sz w:val="22"/>
           <w:szCs w:val="22"/>
         </w:rPr>
-        <w:t xml:space="preserve">Hair parted down the center with the front sections falling to each side, framing the face symmetrically. Timothée Chalamet and multiple BTS members popularized this cut globally. Straight hair produces the cleanest version — the curtains fall in symmetrical lines without frizz or unpredictability.</w:t>
+        <w:t xml:space="preserve">Hair parted down the center with the front sections falling to each side, framing the face symmetrically. Timothée Chalamet and multiple BTS members popularized this cut globally. Straight hair produces the cleanest version. The curtains fall in symmetrical lines without frizz or unpredictability.</w:t>
       </w:r>
     </w:p>
     <w:p>
@@ -3099,7 +3099,7 @@
           <w:sz w:val="22"/>
           <w:szCs w:val="22"/>
         </w:rPr>
-        <w:t xml:space="preserve">Oval, oblong, diamond — softens strong jawlines and balances wider foreheads</w:t>
+        <w:t xml:space="preserve">Oval, oblong, diamond. Softens strong jawlines and balances wider foreheads</w:t>
       </w:r>
     </w:p>
     <w:p>
@@ -3155,7 +3155,7 @@
           <w:sz w:val="22"/>
           <w:szCs w:val="22"/>
         </w:rPr>
-        <w:t xml:space="preserve">Blow-dry each side outward with a round brush — left side to the left, right side to the right, curving slightly inward at the ends. Light styling cream keeps the shape without flattening movement.</w:t>
+        <w:t xml:space="preserve">Blow-dry each side outward with a round brush: left side to the left, right side to the right, curving slightly inward at the ends. Light styling cream keeps the shape without flattening movement.</w:t>
       </w:r>
     </w:p>
     <w:p>
@@ -3241,7 +3241,7 @@
           <w:sz w:val="22"/>
           <w:szCs w:val="22"/>
         </w:rPr>
-        <w:t xml:space="preserve">"Two block cut — disconnected, sides at a #1 or #2, top left 4 inches, no blending."</w:t>
+        <w:t xml:space="preserve">"Two block cut: disconnected, sides at a #1 or #2, top left 4 inches, no blending."</w:t>
       </w:r>
     </w:p>
     <w:p>
@@ -3299,7 +3299,7 @@
           <w:sz w:val="22"/>
           <w:szCs w:val="22"/>
         </w:rPr>
-        <w:t xml:space="preserve">A styling technique where the front section curves inward at the ends, creating a shape that resembles a comma. The fringe reaches mid-forehead to brow level. This style works almost exclusively with straight hair — achieving the precise inward curl on wavy or curly hair requires chemical straightening.</w:t>
+        <w:t xml:space="preserve">A styling technique where the front section curves inward at the ends, creating a shape that resembles a comma. The fringe reaches mid-forehead to brow level. This style works almost exclusively with straight hair. Achieving the precise inward curl on wavy or curly hair requires chemical straightening.</w:t>
       </w:r>
     </w:p>
     <w:p>
@@ -3355,7 +3355,7 @@
           <w:sz w:val="22"/>
           <w:szCs w:val="22"/>
         </w:rPr>
-        <w:t xml:space="preserve">"Comma hair fringe — medium length at the front, light layers, two block structure on the sides."</w:t>
+        <w:t xml:space="preserve">"Comma hair fringe: medium length at the front, light layers, two block structure on the sides."</w:t>
       </w:r>
     </w:p>
     <w:p>
@@ -3413,7 +3413,7 @@
           <w:sz w:val="22"/>
           <w:szCs w:val="22"/>
         </w:rPr>
-        <w:t xml:space="preserve">A longer crew cut — enough length on top (2–3 inches) to create a clean side part. The sides are tapered, not faded, maintaining a conservative profile. JFK wore this cut. In 2026 it remains the standard for intelligent, professional grooming across law, finance, and academia.</w:t>
+        <w:t xml:space="preserve">A longer crew cut with enough length on top (2–3 inches) to create a clean side part. The sides are tapered, not faded, maintaining a conservative profile. JFK wore this cut. In 2026 it remains the standard for intelligent, professional grooming across law, finance, and academia.</w:t>
       </w:r>
     </w:p>
     <w:p>
@@ -3469,7 +3469,7 @@
           <w:sz w:val="22"/>
           <w:szCs w:val="22"/>
         </w:rPr>
-        <w:t xml:space="preserve">"Ivy League — enough length on top to part to the side, tapered sides, clean around the ears."</w:t>
+        <w:t xml:space="preserve">"Ivy League: enough length on top to part to the side, tapered sides, clean around the ears."</w:t>
       </w:r>
     </w:p>
     <w:p>
@@ -3555,7 +3555,7 @@
           <w:sz w:val="22"/>
           <w:szCs w:val="22"/>
         </w:rPr>
-        <w:t xml:space="preserve">All face shapes — the diagonal line softens any profile</w:t>
+        <w:t xml:space="preserve">All face shapes. The diagonal line softens any profile</w:t>
       </w:r>
     </w:p>
     <w:p>
@@ -3641,7 +3641,7 @@
           <w:sz w:val="22"/>
           <w:szCs w:val="22"/>
         </w:rPr>
-        <w:t xml:space="preserve">The burst fade creates a semi-circular pattern radiating outward around the ear — like an arc of gradually increasing hair density. Paired with a textured top, it gives a sporty, dynamic silhouette. For straight hair, the burst creates strong geometric contrast against the naturally smooth top.</w:t>
+        <w:t xml:space="preserve">The burst fade creates a semi-circular pattern radiating outward around the ear, like an arc of gradually increasing hair density. Paired with a textured top, it gives a sporty, dynamic silhouette. For straight hair, the burst creates strong geometric contrast against the naturally smooth top.</w:t>
       </w:r>
     </w:p>
     <w:p>
@@ -3725,7 +3725,7 @@
           <w:sz w:val="22"/>
           <w:szCs w:val="22"/>
         </w:rPr>
-        <w:t xml:space="preserve">The burst pattern is purely barbering technique — no home maintenance needed for the fade itself. Style the top with matte clay for a textured finish. Touch-ups every 2–3 weeks.</w:t>
+        <w:t xml:space="preserve">The burst pattern is purely barbering technique, so no home maintenance needed for the fade itself. Style the top with matte clay for a textured finish. Touch-ups every 2–3 weeks.</w:t>
       </w:r>
     </w:p>
     <w:p>
@@ -3755,7 +3755,7 @@
           <w:sz w:val="22"/>
           <w:szCs w:val="22"/>
         </w:rPr>
-        <w:t xml:space="preserve">All fade work concentrated at the temple area — the zone between the hairline and the ear. The rest of the hair stays fuller. Known regionally as the Brooklyn Blowout. This cut cleanly removes bulk at the temples without changing the overall structure, making it one of the most subtle fades available.</w:t>
+        <w:t xml:space="preserve">All fade work concentrated at the temple area, the zone between the hairline and the ear. The rest of the hair stays fuller. Known regionally as the Brooklyn Blowout. This cut cleanly removes bulk at the temples without changing the overall structure, making it one of the most subtle fades available.</w:t>
       </w:r>
     </w:p>
     <w:p>
@@ -3783,7 +3783,7 @@
           <w:sz w:val="22"/>
           <w:szCs w:val="22"/>
         </w:rPr>
-        <w:t xml:space="preserve">Round, oval, square — the clean temples sharpen the profile</w:t>
+        <w:t xml:space="preserve">Round, oval, square. The clean temples sharpen the profile</w:t>
       </w:r>
     </w:p>
     <w:p>
@@ -3811,7 +3811,7 @@
           <w:sz w:val="22"/>
           <w:szCs w:val="22"/>
         </w:rPr>
-        <w:t xml:space="preserve">"Temple fade — clean at the temples, keep the rest full, low fade finish."</w:t>
+        <w:t xml:space="preserve">"Temple fade: clean at the temples, keep the rest full, low fade finish."</w:t>
       </w:r>
     </w:p>
     <w:p>
@@ -3869,7 +3869,7 @@
           <w:sz w:val="22"/>
           <w:szCs w:val="22"/>
         </w:rPr>
-        <w:t xml:space="preserve">Sharp contrast between long top sections and shaved sides with no blending. Cillian Murphy in Peaky Blinders made this cut iconic. The complete removal of the side hair reduces bulk dramatically — a major advantage for men with thick straight hair who struggle with heavy sides weighing down the top.</w:t>
+        <w:t xml:space="preserve">Sharp contrast between long top sections and shaved sides with no blending. Cillian Murphy in Peaky Blinders made this cut iconic. The complete removal of the side hair reduces bulk dramatically, a major advantage for men with thick straight hair who struggle with heavy sides weighing down the top.</w:t>
       </w:r>
     </w:p>
     <w:p>
@@ -3897,7 +3897,7 @@
           <w:sz w:val="22"/>
           <w:szCs w:val="22"/>
         </w:rPr>
-        <w:t xml:space="preserve">Square, heart — bold visual contrast suits defined features</w:t>
+        <w:t xml:space="preserve">Square, heart. Bold visual contrast suits defined features</w:t>
       </w:r>
     </w:p>
     <w:p>
@@ -3925,7 +3925,7 @@
           <w:sz w:val="22"/>
           <w:szCs w:val="22"/>
         </w:rPr>
-        <w:t xml:space="preserve">"Disconnected undercut — #1 guard on the sides, no blending, 4 to 5 inches on top."</w:t>
+        <w:t xml:space="preserve">"Disconnected undercut: #1 guard on the sides, no blending, 4 to 5 inches on top."</w:t>
       </w:r>
     </w:p>
     <w:p>
@@ -3953,7 +3953,7 @@
           <w:sz w:val="22"/>
           <w:szCs w:val="22"/>
         </w:rPr>
-        <w:t xml:space="preserve">Style the top in any direction — forward, side, or swept back. Use medium-hold matte paste with fingers rather than a comb to maintain natural separation.</w:t>
+        <w:t xml:space="preserve">Style the top in any direction: forward, side, or swept back. Use medium-hold matte paste with fingers rather than a comb to maintain natural separation.</w:t>
       </w:r>
     </w:p>
     <w:p>
@@ -3986,7 +3986,7 @@
           <w:sz w:val="22"/>
           <w:szCs w:val="22"/>
         </w:rPr>
-        <w:t xml:space="preserve">Long straight hair requires more maintenance but offers a distinctive look. The key is regular trims and internal layering — without layers, straight hair at this length falls as a single flat sheet.</w:t>
+        <w:t xml:space="preserve">Long straight hair requires more maintenance but offers a distinctive look. The key is regular trims and internal layering. Without layers, straight hair at this length falls as a single flat sheet.</w:t>
       </w:r>
     </w:p>
     <w:p>
@@ -4016,7 +4016,7 @@
           <w:sz w:val="22"/>
           <w:szCs w:val="22"/>
         </w:rPr>
-        <w:t xml:space="preserve">Medium to long hair (chin to collar length) swept backward and to the sides naturally. Chris Hemsworth is the gold standard for this cut. The bro flow only works when the hair is healthy, shiny, and maintained — damaged or dry straight hair at this length looks neglected rather than intentional.</w:t>
+        <w:t xml:space="preserve">Medium to long hair (chin to collar length) swept backward and to the sides naturally. Chris Hemsworth is the gold standard for this cut. The bro flow only works when the hair is healthy, shiny, and maintained. Damaged or dry straight hair at this length looks neglected rather than intentional.</w:t>
       </w:r>
     </w:p>
     <w:p>
@@ -4044,7 +4044,7 @@
           <w:sz w:val="22"/>
           <w:szCs w:val="22"/>
         </w:rPr>
-        <w:t xml:space="preserve">All face shapes — the deciding factor is hair health, not face shape</w:t>
+        <w:t xml:space="preserve">All face shapes. The deciding factor is hair health, not face shape</w:t>
       </w:r>
     </w:p>
     <w:p>
@@ -4072,7 +4072,7 @@
           <w:sz w:val="22"/>
           <w:szCs w:val="22"/>
         </w:rPr>
-        <w:t xml:space="preserve">"Growing it out for a flow — clean up the ends, add internal layers for movement, keep the length."</w:t>
+        <w:t xml:space="preserve">"Growing it out for a flow. Clean up the ends, add internal layers for movement, keep the length."</w:t>
       </w:r>
     </w:p>
     <w:p>
@@ -4130,7 +4130,7 @@
           <w:sz w:val="22"/>
           <w:szCs w:val="22"/>
         </w:rPr>
-        <w:t xml:space="preserve">When straight hair reaches 8+ inches, pull it into a bun at the back of the crown. Jason Momoa and Jared Leto both wore this style through extended public periods. Straight hair creates a naturally sleek, polished bun — but tension matters. The American Academy of Dermatology warns that tight hairstyles can cause traction alopecia — hair thinning from repeated mechanical pulling. Use soft fabric ties and avoid tying too tightly.</w:t>
+        <w:t xml:space="preserve">When straight hair reaches 8+ inches, pull it into a bun at the back of the crown. Jason Momoa and Jared Leto both wore this style through extended public periods. Straight hair creates a naturally sleek, polished bun, but tension matters. The American Academy of Dermatology warns that tight hairstyles can cause traction alopecia, hair thinning from repeated mechanical pulling. Use soft fabric ties and avoid tying too tightly.</w:t>
       </w:r>
     </w:p>
     <w:p>
@@ -4214,7 +4214,7 @@
           <w:sz w:val="22"/>
           <w:szCs w:val="22"/>
         </w:rPr>
-        <w:t xml:space="preserve">Tie at the natural resting point on the back of the head — not high, not forced. A light smoothing serum tames flyaways without greasiness.</w:t>
+        <w:t xml:space="preserve">Tie at the natural resting point on the back of the head, not high, not forced. A light smoothing serum tames flyaways without greasiness.</w:t>
       </w:r>
     </w:p>
     <w:p>
@@ -4244,7 +4244,7 @@
           <w:sz w:val="22"/>
           <w:szCs w:val="22"/>
         </w:rPr>
-        <w:t xml:space="preserve">Straight hair grown to shoulder length with minimal styling intervention. At this length, straight hair expresses its greatest natural asset: smooth, light-reflecting movement that requires almost no product. Regular trims and conditioning are non-negotiable — split ends at this length travel up the hair shaft and cause breakage.</w:t>
+        <w:t xml:space="preserve">Straight hair grown to shoulder length with minimal styling intervention. At this length, straight hair expresses its greatest natural asset: smooth, light-reflecting movement that requires almost no product. Regular trims and conditioning are non-negotiable. Split ends at this length travel up the hair shaft and cause breakage.</w:t>
       </w:r>
     </w:p>
     <w:p>
@@ -4358,7 +4358,7 @@
           <w:sz w:val="22"/>
           <w:szCs w:val="22"/>
         </w:rPr>
-        <w:t xml:space="preserve">The top section (crown to temples) ties into a small bun while the bottom hangs freely. This gained cultural momentum through the Urban Viking trend in 2025–2026 — blending a raw, masculine aesthetic with groomed sophistication. Straight hair's smooth texture keeps the lower section looking elegant without product.</w:t>
+        <w:t xml:space="preserve">The top section (crown to temples) ties into a small bun while the bottom hangs freely. This gained cultural momentum through the Urban Viking trend in 2025–2026, blending a raw, masculine aesthetic with groomed sophistication. Straight hair's smooth texture keeps the lower section looking elegant without product.</w:t>
       </w:r>
     </w:p>
     <w:p>
@@ -4386,7 +4386,7 @@
           <w:sz w:val="22"/>
           <w:szCs w:val="22"/>
         </w:rPr>
-        <w:t xml:space="preserve">All face shapes — works best at 6–8 inches minimum</w:t>
+        <w:t xml:space="preserve">All face shapes. Works best at 6–8 inches minimum</w:t>
       </w:r>
     </w:p>
     <w:p>
@@ -4414,7 +4414,7 @@
           <w:sz w:val="22"/>
           <w:szCs w:val="22"/>
         </w:rPr>
-        <w:t xml:space="preserve">"Maintaining the length — just trim the ends and keep the layers balanced."</w:t>
+        <w:t xml:space="preserve">"Maintaining the length. Just trim the ends and keep the layers balanced."</w:t>
       </w:r>
     </w:p>
     <w:p>
@@ -4442,7 +4442,7 @@
           <w:sz w:val="22"/>
           <w:szCs w:val="22"/>
         </w:rPr>
-        <w:t xml:space="preserve">Separate at a horizontal line from temple to temple. Tie the top into a small bun with a fabric tie. Leave the rest down — gravity and straight hair's natural weight do the work.</w:t>
+        <w:t xml:space="preserve">Separate at a horizontal line from temple to temple. Tie the top into a small bun with a fabric tie. Leave the rest down. Gravity and straight hair's natural weight do the work.</w:t>
       </w:r>
     </w:p>
     <w:p>
@@ -4472,7 +4472,7 @@
           <w:sz w:val="22"/>
           <w:szCs w:val="22"/>
         </w:rPr>
-        <w:t xml:space="preserve">All hair combed straight back with a polished, deliberate finish. This is the formal evening option — old Hollywood energy. Straight hair achieves the best version of this because the naturally smooth texture prevents frizzing or flyaways that would break the refined surface. Works for weddings, business dinners, and black-tie events.</w:t>
+        <w:t xml:space="preserve">All hair combed straight back with a polished, deliberate finish. This is the formal evening option with old Hollywood energy. Straight hair achieves the best version of this because the naturally smooth texture prevents frizzing or flyaways that would break the refined surface. Works for weddings, business dinners, and black-tie events.</w:t>
       </w:r>
     </w:p>
     <w:p>
@@ -4619,7 +4619,7 @@
           <w:sz w:val="22"/>
           <w:szCs w:val="22"/>
         </w:rPr>
-        <w:t xml:space="preserve">The breakout style of 2025 carrying into 2026. Heavily textured, spiked-up layers on top with softer, shorter sides. The look is controlled chaos — sharp enough to be intentional, messy enough to feel effortless. Straight hair suits this cut well because the texture comes from the cutting technique (point-cutting and razor work), not from natural curl.</w:t>
+        <w:t xml:space="preserve">The breakout style of 2025 carrying into 2026. Heavily textured, spiked-up layers on top with softer, shorter sides. The look is controlled chaos, sharp enough to be intentional, messy enough to feel effortless. Straight hair suits this cut well because the texture comes from the cutting technique (point-cutting and razor work), not from natural curl.</w:t>
       </w:r>
     </w:p>
     <w:p>
@@ -4675,7 +4675,7 @@
           <w:sz w:val="22"/>
           <w:szCs w:val="22"/>
         </w:rPr>
-        <w:t xml:space="preserve">"Warrior cut — heavily textured top with spiked layers, softer sides, not a hard fade."</w:t>
+        <w:t xml:space="preserve">"Warrior cut: heavily textured top with spiked layers, softer sides, not a hard fade."</w:t>
       </w:r>
     </w:p>
     <w:p>
@@ -4733,7 +4733,7 @@
           <w:sz w:val="22"/>
           <w:szCs w:val="22"/>
         </w:rPr>
-        <w:t xml:space="preserve">Medium hair on top with a clean fade on the sides. The top is left slightly longer for a soft, natural flow — not swept back, not pushed forward, just falling in its natural direction with visible movement. This cut captures the 2026 preference for looking styled without looking like you tried.</w:t>
+        <w:t xml:space="preserve">Medium hair on top with a clean fade on the sides. The top is left slightly longer for a soft, natural flow, not swept back, not pushed forward, just falling in its natural direction with visible movement. This cut captures the 2026 preference for looking styled without looking like you tried.</w:t>
       </w:r>
     </w:p>
     <w:p>
@@ -4789,7 +4789,7 @@
           <w:sz w:val="22"/>
           <w:szCs w:val="22"/>
         </w:rPr>
-        <w:t xml:space="preserve">"Flow fade — mid fade on the sides, leave 3 to 4 inches on top with layers for natural movement."</w:t>
+        <w:t xml:space="preserve">"Flow fade: mid fade on the sides, leave 3 to 4 inches on top with layers for natural movement."</w:t>
       </w:r>
     </w:p>
     <w:p>
@@ -4847,7 +4847,7 @@
           <w:sz w:val="22"/>
           <w:szCs w:val="22"/>
         </w:rPr>
-        <w:t xml:space="preserve">The front section falls toward the forehead in a deliberately casual, layered way. The fringe is point-cut into multiple layers to prevent it from falling as one heavy sheet. The result looks effortless but requires a skilled cut — the layers create natural separation that makes the style appear lived-in rather than unkempt.</w:t>
+        <w:t xml:space="preserve">The front section falls toward the forehead in a deliberately casual, layered way. The fringe is point-cut into multiple layers to prevent it from falling as one heavy sheet. The result looks effortless but requires a skilled cut. The layers create natural separation that makes the style appear lived-in rather than unkempt.</w:t>
       </w:r>
     </w:p>
     <w:p>
@@ -4875,7 +4875,7 @@
           <w:sz w:val="22"/>
           <w:szCs w:val="22"/>
         </w:rPr>
-        <w:t xml:space="preserve">All face shapes — especially popular with men in their teens through early 30s</w:t>
+        <w:t xml:space="preserve">All face shapes. Especially popular with men in their teens through early 30s</w:t>
       </w:r>
     </w:p>
     <w:p>
@@ -4903,7 +4903,7 @@
           <w:sz w:val="22"/>
           <w:szCs w:val="22"/>
         </w:rPr>
-        <w:t xml:space="preserve">"Messy fringe — layered through the front with point-cutting, sides tapered, relaxed finish."</w:t>
+        <w:t xml:space="preserve">"Messy fringe: layered through the front with point-cutting, sides tapered, relaxed finish."</w:t>
       </w:r>
     </w:p>
     <w:p>
@@ -4961,7 +4961,7 @@
           <w:sz w:val="22"/>
           <w:szCs w:val="22"/>
         </w:rPr>
-        <w:t xml:space="preserve">Messy layers throughout — choppy levels that flow into longer sides with a tapered back. The shag solves straight hair's biggest problem: flatness. Multiple internal layers at varying lengths force the hair to move in different directions, creating the illusion of natural volume. This cut works at medium to long lengths and suits creative, informal, or outdoor lifestyles.</w:t>
+        <w:t xml:space="preserve">Messy layers throughout: choppy levels that flow into longer sides with a tapered back. The shag solves straight hair's biggest problem: flatness. Multiple internal layers at varying lengths force the hair to move in different directions, creating the illusion of natural volume. This cut works at medium to long lengths and suits creative, informal, or outdoor lifestyles.</w:t>
       </w:r>
     </w:p>
     <w:p>
@@ -5017,7 +5017,7 @@
           <w:sz w:val="22"/>
           <w:szCs w:val="22"/>
         </w:rPr>
-        <w:t xml:space="preserve">"Shag cut — messy layers throughout, soft fringe, slightly longer sides, tapered back."</w:t>
+        <w:t xml:space="preserve">"Shag cut: messy layers throughout, soft fringe, slightly longer sides, tapered back."</w:t>
       </w:r>
     </w:p>
     <w:p>
@@ -5045,7 +5045,7 @@
           <w:sz w:val="22"/>
           <w:szCs w:val="22"/>
         </w:rPr>
-        <w:t xml:space="preserve">A lightweight salt spray on damp hair, rough-dry with fingers, and leave it alone. Avoid brushing — combing layered straight hair defeats the purpose.</w:t>
+        <w:t xml:space="preserve">A lightweight salt spray on damp hair, rough-dry with fingers, and leave it alone. Avoid brushing. Combing layered straight hair defeats the purpose.</w:t>
       </w:r>
     </w:p>
     <w:p>
@@ -5075,7 +5075,7 @@
           <w:sz w:val="22"/>
           <w:szCs w:val="22"/>
         </w:rPr>
-        <w:t xml:space="preserve">One side of the fringe is cut significantly longer than the other, creating a sharp diagonal line across the forehead. The asymmetry introduces a strong visual dynamic that straight hair handles cleanly — the long sweep falls in a precise, predictable line without frizz breaking the angle.</w:t>
+        <w:t xml:space="preserve">One side of the fringe is cut significantly longer than the other, creating a sharp diagonal line across the forehead. The asymmetry introduces a strong visual dynamic that straight hair handles cleanly. The long sweep falls in a precise, predictable line without frizz breaking the angle.</w:t>
       </w:r>
     </w:p>
     <w:p>
@@ -5103,7 +5103,7 @@
           <w:sz w:val="22"/>
           <w:szCs w:val="22"/>
         </w:rPr>
-        <w:t xml:space="preserve">Oval, oblong — the diagonal line adds a horizontal element that shortens a longer face</w:t>
+        <w:t xml:space="preserve">Oval, oblong. The diagonal line adds a horizontal element that shortens a longer face</w:t>
       </w:r>
     </w:p>
     <w:p>
@@ -5131,7 +5131,7 @@
           <w:sz w:val="22"/>
           <w:szCs w:val="22"/>
         </w:rPr>
-        <w:t xml:space="preserve">"Asymmetrical fringe — longer on the right sweeping to the left, shorter on the other side, subtle fade or taper on the sides."</w:t>
+        <w:t xml:space="preserve">"Asymmetrical fringe: longer on the right sweeping to the left, shorter on the other side, subtle fade or taper on the sides."</w:t>
       </w:r>
     </w:p>
     <w:p>
@@ -5159,7 +5159,7 @@
           <w:sz w:val="22"/>
           <w:szCs w:val="22"/>
         </w:rPr>
-        <w:t xml:space="preserve">Blow-dry the fringe in the direction of the longer sweep using a flat brush. Apply a light serum or smoothing cream for shine — matte products fight this style's sleekness.</w:t>
+        <w:t xml:space="preserve">Blow-dry the fringe in the direction of the longer sweep using a flat brush. Apply a light serum or smoothing cream for shine. Matte products fight this style's sleekness.</w:t>
       </w:r>
     </w:p>
     <w:p>
@@ -5230,7 +5230,7 @@
           <w:sz w:val="22"/>
           <w:szCs w:val="22"/>
         </w:rPr>
-        <w:t xml:space="preserve">Towel-dry to damp — not dripping, not dry (30 seconds)</w:t>
+        <w:t xml:space="preserve">Towel-dry to damp, not dripping, not dry (30 seconds)</w:t>
       </w:r>
     </w:p>
     <w:p>
@@ -5276,7 +5276,7 @@
           <w:sz w:val="22"/>
           <w:szCs w:val="22"/>
         </w:rPr>
-        <w:t xml:space="preserve">Blow-dry with direction — up for volume, back for slick, forward for fringe — lift at the roots with fingers or a round brush (2 minutes)</w:t>
+        <w:t xml:space="preserve">Blow-dry with direction: up for volume, back for slick, forward for fringe. Lift at the roots with fingers or a round brush (2 minutes)</w:t>
       </w:r>
     </w:p>
     <w:p>
@@ -5452,7 +5452,7 @@
           <w:sz w:val="22"/>
           <w:szCs w:val="22"/>
         </w:rPr>
-        <w:t xml:space="preserve">Straight hair responds differently to different products. Choosing the wrong one is the most common styling mistake — heavy pomade on fine hair flattens it, light spray on thick hair does nothing. This table matches product types to results.</w:t>
+        <w:t xml:space="preserve">Straight hair responds differently to different products. Choosing the wrong one is the most common styling mistake. Heavy pomade on fine hair flattens it, light spray on thick hair does nothing. This table matches product types to results.</w:t>
       </w:r>
     </w:p>
     <w:tbl>
@@ -5868,7 +5868,7 @@
                 <w:sz w:val="20"/>
                 <w:szCs w:val="20"/>
               </w:rPr>
-              <w:t xml:space="preserve">Hair is fine or thin — the weight pulls it flat</w:t>
+              <w:t xml:space="preserve">Hair is fine or thin. The weight pulls it flat</w:t>
             </w:r>
           </w:p>
         </w:tc>
@@ -6249,7 +6249,7 @@
                 <w:sz w:val="20"/>
                 <w:szCs w:val="20"/>
               </w:rPr>
-              <w:t xml:space="preserve">Oily scalp — it absorbs oil and clumps</w:t>
+              <w:t xml:space="preserve">Oily scalp. It absorbs oil and clumps</w:t>
             </w:r>
           </w:p>
         </w:tc>
@@ -6503,7 +6503,7 @@
                 <w:sz w:val="20"/>
                 <w:szCs w:val="20"/>
               </w:rPr>
-              <w:t xml:space="preserve">You need volume — creams add weight</w:t>
+              <w:t xml:space="preserve">You need volume. Creams add weight</w:t>
             </w:r>
           </w:p>
         </w:tc>
@@ -6797,7 +6797,7 @@
                 <w:sz w:val="20"/>
                 <w:szCs w:val="20"/>
               </w:rPr>
-              <w:t xml:space="preserve">Fastest growth visibility — looks overgrown quickly</w:t>
+              <w:t xml:space="preserve">Fastest growth visibility. Looks overgrown quickly</w:t>
             </w:r>
           </w:p>
         </w:tc>
@@ -7336,7 +7336,7 @@
           <w:sz w:val="22"/>
           <w:szCs w:val="22"/>
         </w:rPr>
-        <w:t xml:space="preserve">The Professional Beauty Association recommends scheduling trims based on how quickly your specific cut loses its intended shape — not on a fixed calendar.</w:t>
+        <w:t xml:space="preserve">The Professional Beauty Association recommends scheduling trims based on how quickly your specific cut loses its intended shape, not on a fixed calendar.</w:t>
       </w:r>
     </w:p>
     <w:p>
@@ -7359,7 +7359,7 @@
           <w:sz w:val="22"/>
           <w:szCs w:val="22"/>
         </w:rPr>
-        <w:t xml:space="preserve">Two to three times per week is enough for most men with straight hair. Straight hair shows oil faster than curly hair because sebum travels down the shaft unobstructed — but daily washing strips natural oils and leaves hair flat and dry. A quality dry shampoo between washes absorbs excess oil without over-stripping.</w:t>
+        <w:t xml:space="preserve">Two to three times per week is enough for most men with straight hair. Straight hair shows oil faster than curly hair because sebum travels down the shaft unobstructed, but daily washing strips natural oils and leaves hair flat and dry. A quality dry shampoo between washes absorbs excess oil without over-stripping.</w:t>
       </w:r>
     </w:p>
     <w:p>
@@ -7402,7 +7402,7 @@
           <w:sz w:val="22"/>
           <w:szCs w:val="22"/>
         </w:rPr>
-        <w:t xml:space="preserve">If your cut needs volume — pompadour, quiff, textured crop, side part — air drying leaves straight hair flat. A blow dryer is not optional for these styles. Two minutes of directed heat changes everything.</w:t>
+        <w:t xml:space="preserve">If your cut needs volume (pompadour, quiff, textured crop, side part), air drying leaves straight hair flat. A blow dryer is not optional for these styles. Two minutes of directed heat changes everything.</w:t>
       </w:r>
     </w:p>
     <w:p>
@@ -7494,7 +7494,7 @@
           <w:sz w:val="22"/>
           <w:szCs w:val="22"/>
         </w:rPr>
-        <w:t xml:space="preserve">Many hairstyle photos online show naturally wavy hair that has been straightened or styled with texture. The same cut on naturally straight hair will not look identical — the internal movement is different. Show your barber multiple reference photos and ask for their honest assessment of how the cut will translate to your texture.</w:t>
+        <w:t xml:space="preserve">Many hairstyle photos online show naturally wavy hair that has been straightened or styled with texture. The same cut on naturally straight hair will not look identical. The internal movement is different. Show your barber multiple reference photos and ask for their honest assessment of how the cut will translate to your texture.</w:t>
       </w:r>
     </w:p>
     <w:p>
@@ -7544,7 +7544,7 @@
           <w:sz w:val="22"/>
           <w:szCs w:val="22"/>
         </w:rPr>
-        <w:t xml:space="preserve">Yes, if the base cut supports it. A 3–4 inch top with tapered sides lets you wear a side part one day and a slick back the next — the only change is product and blow-dry direction. Shorter cuts like a buzz or crew cut are locked into one look. Medium-length cuts give you the most daily flexibility.</w:t>
+        <w:t xml:space="preserve">Yes, if the base cut supports it. A 3–4 inch top with tapered sides lets you wear a side part one day and a slick back the next. The only change is product and blow-dry direction. Shorter cuts like a buzz or crew cut are locked into one look. Medium-length cuts give you the most daily flexibility.</w:t>
       </w:r>
     </w:p>
     <w:p>
@@ -7574,7 +7574,7 @@
           <w:sz w:val="22"/>
           <w:szCs w:val="22"/>
         </w:rPr>
-        <w:t xml:space="preserve">The awkward stage hits around weeks 6–10, when the sides puff outward while the top is still catching up. Ask your barber for maintenance trims on the sides only — keep them tapered while the top grows. A headband, styling cream, or a backward sweep with light pomade hides the transition. Most men need 4–6 months to go from a crew cut to a combable medium length.</w:t>
+        <w:t xml:space="preserve">The awkward stage hits around weeks 6–10, when the sides puff outward while the top is still catching up. Ask your barber for maintenance trims on the sides only. Keep them tapered while the top grows. A headband, styling cream, or a backward sweep with light pomade hides the transition. Most men need 4–6 months to go from a crew cut to a combable medium length.</w:t>
       </w:r>
     </w:p>
     <w:p>
@@ -7604,7 +7604,7 @@
           <w:sz w:val="22"/>
           <w:szCs w:val="22"/>
         </w:rPr>
-        <w:t xml:space="preserve">Straight hair flattens overnight more than any other texture because the smooth strands compress against the pillow. A silk or satin pillowcase reduces friction and static. In the morning, a 30-second blast of heat at the roots with a blow dryer restores lift without re-wetting. Avoid cotton pillowcases — the rougher surface pulls moisture from the hair and increases next-day flatness.</w:t>
+        <w:t xml:space="preserve">Straight hair flattens overnight more than any other texture because the smooth strands compress against the pillow. A silk or satin pillowcase reduces friction and static. In the morning, a 30-second blast of heat at the roots with a blow dryer restores lift without re-wetting. Avoid cotton pillowcases. The rougher surface pulls moisture from the hair and increases next-day flatness.</w:t>
       </w:r>
     </w:p>
     <w:p>
@@ -7634,7 +7634,7 @@
           <w:sz w:val="22"/>
           <w:szCs w:val="22"/>
         </w:rPr>
-        <w:t xml:space="preserve">Both. A reference photo sets the visual target, but verbal instructions prevent misinterpretation. Tell your barber the guard number you want on the sides, the length on top in inches, and whether you want a fade or a taper. Photos of celebrities often show post-production styling or naturally wavy hair — your barber can flag what will translate differently on your texture.</w:t>
+        <w:t xml:space="preserve">Both. A reference photo sets the visual target, but verbal instructions prevent misinterpretation. Tell your barber the guard number you want on the sides, the length on top in inches, and whether you want a fade or a taper. Photos of celebrities often show post-production styling or naturally wavy hair. Your barber can flag what will translate differently on your texture.</w:t>
       </w:r>
     </w:p>
     <w:p>
@@ -7664,7 +7664,7 @@
           <w:sz w:val="22"/>
           <w:szCs w:val="22"/>
         </w:rPr>
-        <w:t xml:space="preserve">Three reasons. First, barbers blow-dry with professional-grade heat and technique — most men skip the dryer at home. Second, barbers apply product to damp hair at the right moisture level, not to fully dry or soaking wet hair. Third, the cut looks freshest on day one; after a week of sleeping, sweating, and touching it, shape softens. Learning to blow-dry with direction — even for two minutes — closes most of the gap between salon finish and home finish.</w:t>
+        <w:t xml:space="preserve">Three reasons. First, barbers blow-dry with professional-grade heat and technique. Most men skip the dryer at home. Second, barbers apply product to damp hair at the right moisture level, not to fully dry or soaking wet hair. Third, the cut looks freshest on day one; after a week of sleeping, sweating, and touching it, shape softens. Learning to blow-dry with direction, even for two minutes, closes most of the gap between salon finish and home finish.</w:t>
       </w:r>
     </w:p>
     <w:p>
@@ -7694,7 +7694,7 @@
           <w:sz w:val="22"/>
           <w:szCs w:val="22"/>
         </w:rPr>
-        <w:t xml:space="preserve">A taper gradually shortens hair from top to bottom but leaves visible length at the lowest point — typically a #2 or #3 guard at the neckline. A fade takes that gradient all the way down to bare skin. Tapers look more conservative and suit professional environments. Fades create sharper contrast and read as more modern. Both work well on straight hair — the choice is about how much contrast you want between the top and sides.</w:t>
+        <w:t xml:space="preserve">A taper gradually shortens hair from top to bottom but leaves visible length at the lowest point, typically a #2 or #3 guard at the neckline. A fade takes that gradient all the way down to bare skin. Tapers look more conservative and suit professional environments. Fades create sharper contrast and read as more modern. Both work well on straight hair. The choice is about how much contrast you want between the top and sides.</w:t>
       </w:r>
     </w:p>
     <w:sectPr>

</xml_diff>